<commit_message>
Add Assignment_11 (Edit Food_App for assignment_11)
</commit_message>
<xml_diff>
--- a/2.Assignments/Assignment_9 _10/Assignment_9-LMS.docx
+++ b/2.Assignments/Assignment_9 _10/Assignment_9-LMS.docx
@@ -398,30 +398,22 @@
       </w:r>
       <w:hyperlink r:id="rId13" w:history="1">
         <w:r>
-          <w:rPr>
-            <w:rStyle w:val="Hyperlink"/>
-            <w:sz w:val="40"/>
-            <w:szCs w:val="40"/>
-          </w:rPr>
-          <w:t xml:space="preserve">DEPI---Flutter-Track-/2.Assignments/Assignment_9 _10 at main · </w:t>
+          <w:t xml:space="preserve"> </w:t>
         </w:r>
-        <w:proofErr w:type="spellStart"/>
+        <w:hyperlink r:id="rId14" w:history="1">
+          <w:r>
+            <w:rPr>
+              <w:color w:val="0000FF"/>
+              <w:u w:val="single"/>
+            </w:rPr>
+            <w:t>DEPI---Flutter-Track-/2.Assignments/Assignment_9 _10 at main · AbdulrhmanBadwy/DEPI---Flutter-Track-</w:t>
+          </w:r>
+        </w:hyperlink>
         <w:r>
           <w:rPr>
             <w:rStyle w:val="Hyperlink"/>
-            <w:sz w:val="40"/>
-            <w:szCs w:val="40"/>
           </w:rPr>
-          <w:t>AbdulrhmanBadwy</w:t>
-        </w:r>
-        <w:proofErr w:type="spellEnd"/>
-        <w:r>
-          <w:rPr>
-            <w:rStyle w:val="Hyperlink"/>
-            <w:sz w:val="40"/>
-            <w:szCs w:val="40"/>
-          </w:rPr>
-          <w:t>/DEPI---Flutter-Track</w:t>
+          <w:t xml:space="preserve"> </w:t>
         </w:r>
         <w:r>
           <w:rPr>
@@ -1094,7 +1086,6 @@
   <w:style w:type="character" w:default="1" w:styleId="DefaultParagraphFont">
     <w:name w:val="Default Paragraph Font"/>
     <w:uiPriority w:val="1"/>
-    <w:semiHidden/>
     <w:unhideWhenUsed/>
   </w:style>
   <w:style w:type="table" w:default="1" w:styleId="TableNormal">

</xml_diff>